<commit_message>
Deploy bilisuma build from b7e7afe62c0b7a1e5e7e2a21aa915d062322c6f4 naolk35/doc-generator-app@b7e7afe62c0b7a1e5e7e2a21aa915d062322c6f4
</commit_message>
<xml_diff>
--- a/OF_OCAPD_Application.docx
+++ b/OF_OCAPD_Application.docx
@@ -43,29 +43,7 @@
           <w:szCs w:val="24"/>
           <w:u w:val="single"/>
         </w:rPr>
-        <w:t>{</w:t>
-      </w:r>
-      <w:proofErr w:type="spellStart"/>
-      <w:r>
-        <w:rPr>
-          <w:rFonts w:ascii="Helvetica World" w:hAnsi="Helvetica World" w:cs="Helvetica World"/>
-          <w:b/>
-          <w:sz w:val="24"/>
-          <w:szCs w:val="24"/>
-          <w:u w:val="single"/>
-        </w:rPr>
-        <w:t>FirstName</w:t>
-      </w:r>
-      <w:proofErr w:type="spellEnd"/>
-      <w:r>
-        <w:rPr>
-          <w:rFonts w:ascii="Helvetica World" w:hAnsi="Helvetica World" w:cs="Helvetica World"/>
-          <w:b/>
-          <w:sz w:val="24"/>
-          <w:szCs w:val="24"/>
-          <w:u w:val="single"/>
-        </w:rPr>
-        <w:t>}</w:t>
+        <w:t>{FirstName}</w:t>
       </w:r>
       <w:r>
         <w:rPr>
@@ -100,6 +78,15 @@
           <w:b/>
           <w:sz w:val="24"/>
           <w:szCs w:val="24"/>
+        </w:rPr>
+        <w:tab/>
+      </w:r>
+      <w:r>
+        <w:rPr>
+          <w:rFonts w:ascii="Helvetica World" w:hAnsi="Helvetica World" w:cs="Helvetica World"/>
+          <w:b/>
+          <w:sz w:val="24"/>
+          <w:szCs w:val="24"/>
           <w:u w:val="single"/>
         </w:rPr>
         <w:t xml:space="preserve"> </w:t>
@@ -122,29 +109,7 @@
           <w:szCs w:val="24"/>
           <w:u w:val="single"/>
         </w:rPr>
-        <w:t>{</w:t>
-      </w:r>
-      <w:proofErr w:type="spellStart"/>
-      <w:r>
-        <w:rPr>
-          <w:rFonts w:ascii="Helvetica World" w:hAnsi="Helvetica World" w:cs="Helvetica World"/>
-          <w:b/>
-          <w:sz w:val="24"/>
-          <w:szCs w:val="24"/>
-          <w:u w:val="single"/>
-        </w:rPr>
-        <w:t>MiddleName</w:t>
-      </w:r>
-      <w:proofErr w:type="spellEnd"/>
-      <w:r>
-        <w:rPr>
-          <w:rFonts w:ascii="Helvetica World" w:hAnsi="Helvetica World" w:cs="Helvetica World"/>
-          <w:b/>
-          <w:sz w:val="24"/>
-          <w:szCs w:val="24"/>
-          <w:u w:val="single"/>
-        </w:rPr>
-        <w:t>}</w:t>
+        <w:t>{MiddleName}</w:t>
       </w:r>
       <w:r>
         <w:rPr>
@@ -183,37 +148,26 @@
         </w:rPr>
         <w:tab/>
       </w:r>
-      <w:r>
-        <w:rPr>
-          <w:rFonts w:ascii="Helvetica World" w:hAnsi="Helvetica World" w:cs="Helvetica World"/>
-          <w:b/>
-          <w:sz w:val="24"/>
-          <w:szCs w:val="24"/>
-          <w:u w:val="single"/>
-        </w:rPr>
-        <w:t>{</w:t>
-      </w:r>
-      <w:proofErr w:type="spellStart"/>
-      <w:r>
-        <w:rPr>
-          <w:rFonts w:ascii="Helvetica World" w:hAnsi="Helvetica World" w:cs="Helvetica World"/>
-          <w:b/>
-          <w:sz w:val="24"/>
-          <w:szCs w:val="24"/>
-          <w:u w:val="single"/>
-        </w:rPr>
-        <w:t>LastName</w:t>
-      </w:r>
-      <w:proofErr w:type="spellEnd"/>
-      <w:r>
-        <w:rPr>
-          <w:rFonts w:ascii="Helvetica World" w:hAnsi="Helvetica World" w:cs="Helvetica World"/>
-          <w:b/>
-          <w:sz w:val="24"/>
-          <w:szCs w:val="24"/>
-          <w:u w:val="single"/>
-        </w:rPr>
-        <w:t>}</w:t>
+      <w:bookmarkStart w:id="0" w:name="_GoBack"/>
+      <w:bookmarkEnd w:id="0"/>
+      <w:r>
+        <w:rPr>
+          <w:rFonts w:ascii="Helvetica World" w:hAnsi="Helvetica World" w:cs="Helvetica World"/>
+          <w:b/>
+          <w:sz w:val="24"/>
+          <w:szCs w:val="24"/>
+        </w:rPr>
+        <w:tab/>
+      </w:r>
+      <w:r>
+        <w:rPr>
+          <w:rFonts w:ascii="Helvetica World" w:hAnsi="Helvetica World" w:cs="Helvetica World"/>
+          <w:b/>
+          <w:sz w:val="24"/>
+          <w:szCs w:val="24"/>
+          <w:u w:val="single"/>
+        </w:rPr>
+        <w:t>{LastName}</w:t>
       </w:r>
       <w:r>
         <w:rPr>
@@ -424,8 +378,6 @@
         </w:rPr>
         <w:tab/>
       </w:r>
-      <w:bookmarkStart w:id="0" w:name="_GoBack"/>
-      <w:bookmarkEnd w:id="0"/>
       <w:r>
         <w:rPr>
           <w:rFonts w:ascii="Helvetica World" w:hAnsi="Helvetica World" w:cs="Helvetica World"/>
@@ -467,16 +419,7 @@
           <w:sz w:val="24"/>
           <w:szCs w:val="24"/>
         </w:rPr>
-        <w:t xml:space="preserve">Birth </w:t>
-      </w:r>
-      <w:proofErr w:type="gramStart"/>
-      <w:r>
-        <w:rPr>
-          <w:rFonts w:ascii="Helvetica World" w:hAnsi="Helvetica World" w:cs="Helvetica World"/>
-          <w:sz w:val="24"/>
-          <w:szCs w:val="24"/>
-        </w:rPr>
-        <w:t xml:space="preserve">date </w:t>
+        <w:t xml:space="preserve">Birth date </w:t>
       </w:r>
       <w:r>
         <w:rPr>
@@ -495,18 +438,7 @@
           <w:szCs w:val="24"/>
           <w:u w:val="single"/>
         </w:rPr>
-        <w:t>{</w:t>
-      </w:r>
-      <w:proofErr w:type="gramEnd"/>
-      <w:r>
-        <w:rPr>
-          <w:rFonts w:ascii="Helvetica World" w:hAnsi="Helvetica World" w:cs="Helvetica World"/>
-          <w:b/>
-          <w:sz w:val="24"/>
-          <w:szCs w:val="24"/>
-          <w:u w:val="single"/>
-        </w:rPr>
-        <w:t>DOB}</w:t>
+        <w:t>{DOB}</w:t>
       </w:r>
       <w:r>
         <w:rPr>
@@ -655,16 +587,7 @@
           <w:sz w:val="24"/>
           <w:szCs w:val="24"/>
         </w:rPr>
-        <w:t xml:space="preserve">      </w:t>
-      </w:r>
-      <w:proofErr w:type="gramStart"/>
-      <w:r>
-        <w:rPr>
-          <w:rFonts w:ascii="Helvetica World" w:hAnsi="Helvetica World" w:cs="Helvetica World"/>
-          <w:sz w:val="24"/>
-          <w:szCs w:val="24"/>
-        </w:rPr>
-        <w:t xml:space="preserve">Address </w:t>
+        <w:t xml:space="preserve">      Address </w:t>
       </w:r>
       <w:r>
         <w:rPr>
@@ -684,18 +607,7 @@
           <w:szCs w:val="24"/>
           <w:u w:val="single"/>
         </w:rPr>
-        <w:t>{</w:t>
-      </w:r>
-      <w:proofErr w:type="gramEnd"/>
-      <w:r>
-        <w:rPr>
-          <w:rFonts w:ascii="Helvetica World" w:hAnsi="Helvetica World" w:cs="Helvetica World"/>
-          <w:b/>
-          <w:sz w:val="24"/>
-          <w:szCs w:val="24"/>
-          <w:u w:val="single"/>
-        </w:rPr>
-        <w:t>Region}</w:t>
+        <w:t>{Region}</w:t>
       </w:r>
       <w:r>
         <w:rPr>
@@ -717,32 +629,13 @@
           <w:szCs w:val="24"/>
         </w:rPr>
       </w:pPr>
-      <w:proofErr w:type="spellStart"/>
-      <w:r>
-        <w:rPr>
-          <w:rFonts w:ascii="Helvetica World" w:hAnsi="Helvetica World" w:cs="Helvetica World"/>
-          <w:sz w:val="24"/>
-          <w:szCs w:val="24"/>
-        </w:rPr>
-        <w:t>Woreda`s</w:t>
-      </w:r>
-      <w:proofErr w:type="spellEnd"/>
-      <w:r>
-        <w:rPr>
-          <w:rFonts w:ascii="Helvetica World" w:hAnsi="Helvetica World" w:cs="Helvetica World"/>
-          <w:sz w:val="24"/>
-          <w:szCs w:val="24"/>
-        </w:rPr>
-        <w:t xml:space="preserve">/ Sub </w:t>
-      </w:r>
-      <w:proofErr w:type="gramStart"/>
-      <w:r>
-        <w:rPr>
-          <w:rFonts w:ascii="Helvetica World" w:hAnsi="Helvetica World" w:cs="Helvetica World"/>
-          <w:sz w:val="24"/>
-          <w:szCs w:val="24"/>
-        </w:rPr>
-        <w:t xml:space="preserve">City </w:t>
+      <w:r>
+        <w:rPr>
+          <w:rFonts w:ascii="Helvetica World" w:hAnsi="Helvetica World" w:cs="Helvetica World"/>
+          <w:sz w:val="24"/>
+          <w:szCs w:val="24"/>
+        </w:rPr>
+        <w:t xml:space="preserve">Woreda`s/ Sub City </w:t>
       </w:r>
       <w:r>
         <w:rPr>
@@ -761,30 +654,7 @@
           <w:szCs w:val="24"/>
           <w:u w:val="single"/>
         </w:rPr>
-        <w:t>{</w:t>
-      </w:r>
-      <w:proofErr w:type="spellStart"/>
-      <w:proofErr w:type="gramEnd"/>
-      <w:r>
-        <w:rPr>
-          <w:rFonts w:ascii="Helvetica World" w:hAnsi="Helvetica World" w:cs="Helvetica World"/>
-          <w:b/>
-          <w:sz w:val="24"/>
-          <w:szCs w:val="24"/>
-          <w:u w:val="single"/>
-        </w:rPr>
-        <w:t>CityZone</w:t>
-      </w:r>
-      <w:proofErr w:type="spellEnd"/>
-      <w:r>
-        <w:rPr>
-          <w:rFonts w:ascii="Helvetica World" w:hAnsi="Helvetica World" w:cs="Helvetica World"/>
-          <w:b/>
-          <w:sz w:val="24"/>
-          <w:szCs w:val="24"/>
-          <w:u w:val="single"/>
-        </w:rPr>
-        <w:t>}</w:t>
+        <w:t>{CityZone}</w:t>
       </w:r>
       <w:r>
         <w:rPr>
@@ -801,23 +671,15 @@
           <w:sz w:val="24"/>
           <w:szCs w:val="24"/>
         </w:rPr>
-        <w:t xml:space="preserve">               </w:t>
-      </w:r>
-      <w:proofErr w:type="spellStart"/>
-      <w:r>
-        <w:rPr>
-          <w:rFonts w:ascii="Helvetica World" w:hAnsi="Helvetica World" w:cs="Helvetica World"/>
-          <w:sz w:val="24"/>
-          <w:szCs w:val="24"/>
-        </w:rPr>
-        <w:t>Kebele</w:t>
-      </w:r>
-      <w:proofErr w:type="spellEnd"/>
-      <w:r>
-        <w:rPr>
-          <w:rFonts w:ascii="Helvetica World" w:hAnsi="Helvetica World" w:cs="Helvetica World"/>
-          <w:sz w:val="24"/>
-          <w:szCs w:val="24"/>
+        <w:t xml:space="preserve">               Kebele </w:t>
+      </w:r>
+      <w:r>
+        <w:rPr>
+          <w:rFonts w:ascii="Helvetica World" w:hAnsi="Helvetica World" w:cs="Helvetica World"/>
+          <w:b/>
+          <w:sz w:val="24"/>
+          <w:szCs w:val="24"/>
+          <w:u w:val="single"/>
         </w:rPr>
         <w:t xml:space="preserve"> </w:t>
       </w:r>
@@ -829,65 +691,15 @@
           <w:szCs w:val="24"/>
           <w:u w:val="single"/>
         </w:rPr>
-        <w:t xml:space="preserve"> </w:t>
-      </w:r>
-      <w:r>
-        <w:rPr>
-          <w:rFonts w:ascii="Helvetica World" w:hAnsi="Helvetica World" w:cs="Helvetica World"/>
-          <w:b/>
-          <w:sz w:val="24"/>
-          <w:szCs w:val="24"/>
-          <w:u w:val="single"/>
-        </w:rPr>
-        <w:t>{</w:t>
-      </w:r>
-      <w:proofErr w:type="spellStart"/>
-      <w:r>
-        <w:rPr>
-          <w:rFonts w:ascii="Helvetica World" w:hAnsi="Helvetica World" w:cs="Helvetica World"/>
-          <w:b/>
-          <w:sz w:val="24"/>
-          <w:szCs w:val="24"/>
-          <w:u w:val="single"/>
-        </w:rPr>
-        <w:t>DistrictKebele</w:t>
-      </w:r>
-      <w:proofErr w:type="spellEnd"/>
-      <w:r>
-        <w:rPr>
-          <w:rFonts w:ascii="Helvetica World" w:hAnsi="Helvetica World" w:cs="Helvetica World"/>
-          <w:b/>
-          <w:sz w:val="24"/>
-          <w:szCs w:val="24"/>
-          <w:u w:val="single"/>
-        </w:rPr>
-        <w:t xml:space="preserve">}   </w:t>
-      </w:r>
-      <w:r>
-        <w:rPr>
-          <w:rFonts w:ascii="Helvetica World" w:hAnsi="Helvetica World" w:cs="Helvetica World"/>
-          <w:sz w:val="24"/>
-          <w:szCs w:val="24"/>
-        </w:rPr>
-        <w:t xml:space="preserve">                   </w:t>
-      </w:r>
-      <w:proofErr w:type="spellStart"/>
-      <w:r>
-        <w:rPr>
-          <w:rFonts w:ascii="Helvetica World" w:hAnsi="Helvetica World" w:cs="Helvetica World"/>
-          <w:sz w:val="24"/>
-          <w:szCs w:val="24"/>
-        </w:rPr>
-        <w:t>H.No</w:t>
-      </w:r>
-      <w:proofErr w:type="spellEnd"/>
-      <w:r>
-        <w:rPr>
-          <w:rFonts w:ascii="Helvetica World" w:hAnsi="Helvetica World" w:cs="Helvetica World"/>
-          <w:sz w:val="24"/>
-          <w:szCs w:val="24"/>
-        </w:rPr>
-        <w:t xml:space="preserve"> _________</w:t>
+        <w:t xml:space="preserve">{DistrictKebele}   </w:t>
+      </w:r>
+      <w:r>
+        <w:rPr>
+          <w:rFonts w:ascii="Helvetica World" w:hAnsi="Helvetica World" w:cs="Helvetica World"/>
+          <w:sz w:val="24"/>
+          <w:szCs w:val="24"/>
+        </w:rPr>
+        <w:t xml:space="preserve">                   H.No _________</w:t>
       </w:r>
     </w:p>
     <w:p>
@@ -907,16 +719,7 @@
           <w:sz w:val="24"/>
           <w:szCs w:val="24"/>
         </w:rPr>
-        <w:t>Phone/</w:t>
-      </w:r>
-      <w:proofErr w:type="gramStart"/>
-      <w:r>
-        <w:rPr>
-          <w:rFonts w:ascii="Helvetica World" w:hAnsi="Helvetica World" w:cs="Helvetica World"/>
-          <w:sz w:val="24"/>
-          <w:szCs w:val="24"/>
-        </w:rPr>
-        <w:t xml:space="preserve">Residence </w:t>
+        <w:t xml:space="preserve">Phone/Residence </w:t>
       </w:r>
       <w:r>
         <w:rPr>
@@ -936,18 +739,7 @@
           <w:szCs w:val="24"/>
           <w:u w:val="single"/>
         </w:rPr>
-        <w:t>{</w:t>
-      </w:r>
-      <w:proofErr w:type="gramEnd"/>
-      <w:r>
-        <w:rPr>
-          <w:rFonts w:ascii="Helvetica World" w:hAnsi="Helvetica World" w:cs="Helvetica World"/>
-          <w:b/>
-          <w:sz w:val="24"/>
-          <w:szCs w:val="24"/>
-          <w:u w:val="single"/>
-        </w:rPr>
-        <w:t xml:space="preserve">PhoneNumber1}   </w:t>
+        <w:t xml:space="preserve">{PhoneNumber1}   </w:t>
       </w:r>
       <w:r>
         <w:rPr>
@@ -974,25 +766,7 @@
           <w:sz w:val="24"/>
           <w:szCs w:val="24"/>
         </w:rPr>
-        <w:t>Presently</w:t>
-      </w:r>
-      <w:proofErr w:type="gramStart"/>
-      <w:r>
-        <w:rPr>
-          <w:rFonts w:ascii="Helvetica World" w:hAnsi="Helvetica World" w:cs="Helvetica World"/>
-          <w:sz w:val="24"/>
-          <w:szCs w:val="24"/>
-        </w:rPr>
-        <w:t>:-</w:t>
-      </w:r>
-      <w:proofErr w:type="gramEnd"/>
-      <w:r>
-        <w:rPr>
-          <w:rFonts w:ascii="Helvetica World" w:hAnsi="Helvetica World" w:cs="Helvetica World"/>
-          <w:sz w:val="24"/>
-          <w:szCs w:val="24"/>
-        </w:rPr>
-        <w:t xml:space="preserve">  Student _____        Employed ___       Self Employed __                  Job Sector_</w:t>
+        <w:t>Presently:-  Student _____        Employed ___       Self Employed __                  Job Sector_</w:t>
       </w:r>
       <w:r>
         <w:rPr>
@@ -1029,16 +803,7 @@
           <w:sz w:val="24"/>
           <w:szCs w:val="24"/>
         </w:rPr>
-        <w:t xml:space="preserve">Year of </w:t>
-      </w:r>
-      <w:proofErr w:type="gramStart"/>
-      <w:r>
-        <w:rPr>
-          <w:rFonts w:ascii="Helvetica World" w:hAnsi="Helvetica World" w:cs="Helvetica World"/>
-          <w:sz w:val="24"/>
-          <w:szCs w:val="24"/>
-        </w:rPr>
-        <w:t xml:space="preserve">Graduation </w:t>
+        <w:t xml:space="preserve">Year of Graduation </w:t>
       </w:r>
       <w:r>
         <w:rPr>
@@ -1057,46 +822,93 @@
           <w:u w:val="thick"/>
           <w:lang w:eastAsia="om-Ethi-ET"/>
         </w:rPr>
-        <w:t>{</w:t>
-      </w:r>
-      <w:proofErr w:type="spellStart"/>
-      <w:proofErr w:type="gramEnd"/>
-      <w:r>
-        <w:rPr>
-          <w:rFonts w:ascii="Courier New" w:hAnsi="Courier New" w:cs="Courier New"/>
-          <w:b/>
-          <w:szCs w:val="20"/>
-          <w:u w:val="thick"/>
+        <w:t>{TrainingEndDate}</w:t>
+      </w:r>
+      <w:r>
+        <w:rPr>
+          <w:b/>
+          <w:sz w:val="28"/>
+          <w:u w:val="single"/>
+        </w:rPr>
+        <w:t xml:space="preserve">  </w:t>
+      </w:r>
+      <w:r>
+        <w:rPr>
+          <w:rFonts w:ascii="Helvetica World" w:hAnsi="Helvetica World" w:cs="Helvetica World"/>
+          <w:sz w:val="24"/>
+          <w:szCs w:val="24"/>
+        </w:rPr>
+        <w:t xml:space="preserve">               Employment Date ________________________</w:t>
+      </w:r>
+    </w:p>
+    <w:p>
+      <w:pPr>
+        <w:rPr>
+          <w:rFonts w:ascii="Times New Roman" w:eastAsia="Times New Roman" w:hAnsi="Times New Roman" w:cs="Times New Roman"/>
+          <w:sz w:val="24"/>
+          <w:szCs w:val="24"/>
           <w:lang w:eastAsia="om-Ethi-ET"/>
         </w:rPr>
-        <w:t>TrainingEndDate</w:t>
-      </w:r>
-      <w:proofErr w:type="spellEnd"/>
-      <w:r>
-        <w:rPr>
-          <w:rFonts w:ascii="Courier New" w:hAnsi="Courier New" w:cs="Courier New"/>
-          <w:b/>
-          <w:szCs w:val="20"/>
-          <w:u w:val="thick"/>
-          <w:lang w:eastAsia="om-Ethi-ET"/>
-        </w:rPr>
-        <w:t>}</w:t>
-      </w:r>
-      <w:r>
-        <w:rPr>
-          <w:b/>
-          <w:sz w:val="28"/>
-          <w:u w:val="single"/>
-        </w:rPr>
-        <w:t xml:space="preserve">  </w:t>
-      </w:r>
-      <w:r>
-        <w:rPr>
-          <w:rFonts w:ascii="Helvetica World" w:hAnsi="Helvetica World" w:cs="Helvetica World"/>
-          <w:sz w:val="24"/>
-          <w:szCs w:val="24"/>
-        </w:rPr>
-        <w:t xml:space="preserve">               Employment Date ________________________</w:t>
+      </w:pPr>
+      <w:r>
+        <w:rPr>
+          <w:rFonts w:ascii="Helvetica World" w:hAnsi="Helvetica World" w:cs="Helvetica World"/>
+          <w:sz w:val="24"/>
+          <w:szCs w:val="24"/>
+        </w:rPr>
+        <w:t xml:space="preserve">(Name of Occupation) </w:t>
+      </w:r>
+      <w:r>
+        <w:rPr>
+          <w:rFonts w:ascii="Helvetica World" w:hAnsi="Helvetica World" w:cs="Helvetica World"/>
+          <w:b/>
+          <w:sz w:val="24"/>
+          <w:szCs w:val="24"/>
+          <w:u w:val="single"/>
+        </w:rPr>
+        <w:t>{Subject}</w:t>
+      </w:r>
+      <w:r>
+        <w:rPr>
+          <w:rFonts w:ascii="Helvetica World" w:hAnsi="Helvetica World" w:cs="Helvetica World"/>
+          <w:sz w:val="24"/>
+          <w:szCs w:val="24"/>
+          <w:lang w:val="en-GB"/>
+        </w:rPr>
+        <w:t xml:space="preserve"> Assessment Center </w:t>
+      </w:r>
+      <w:r>
+        <w:rPr>
+          <w:rFonts w:ascii="Times New Roman" w:eastAsia="Times New Roman" w:hAnsi="Times New Roman" w:cs="Times New Roman"/>
+          <w:b/>
+          <w:sz w:val="24"/>
+          <w:szCs w:val="24"/>
+          <w:u w:val="single"/>
+          <w:lang w:val="om-Ethi-ET" w:eastAsia="om-Ethi-ET"/>
+        </w:rPr>
+        <w:fldChar w:fldCharType="begin"/>
+      </w:r>
+      <w:r>
+        <w:rPr>
+          <w:rFonts w:ascii="Times New Roman" w:eastAsia="Times New Roman" w:hAnsi="Times New Roman" w:cs="Times New Roman"/>
+          <w:b/>
+          <w:sz w:val="24"/>
+          <w:szCs w:val="24"/>
+          <w:u w:val="single"/>
+          <w:lang w:val="om-Ethi-ET" w:eastAsia="om-Ethi-ET"/>
+        </w:rPr>
+        <w:instrText>CompanyNameEnglish</w:instrText>
+      </w:r>
+      <w:r>
+        <w:rPr>
+          <w:rFonts w:ascii="Times New Roman" w:eastAsia="Times New Roman" w:hAnsi="Times New Roman" w:cs="Times New Roman"/>
+          <w:b/>
+          <w:sz w:val="24"/>
+          <w:szCs w:val="24"/>
+          <w:u w:val="single"/>
+          <w:lang w:val="om-Ethi-ET" w:eastAsia="om-Ethi-ET"/>
+        </w:rPr>
+        <w:fldChar w:fldCharType="end"/>
       </w:r>
     </w:p>
     <w:p>
@@ -1106,7 +918,6 @@
           <w:rFonts w:ascii="Helvetica World" w:hAnsi="Helvetica World" w:cs="Helvetica World"/>
           <w:sz w:val="24"/>
           <w:szCs w:val="24"/>
-          <w:lang w:val="en-GB"/>
         </w:rPr>
       </w:pPr>
       <w:r>
@@ -1115,44 +926,15 @@
           <w:sz w:val="24"/>
           <w:szCs w:val="24"/>
         </w:rPr>
-        <w:t xml:space="preserve">(Name of Occupation) </w:t>
-      </w:r>
-      <w:r>
-        <w:rPr>
-          <w:rFonts w:ascii="Helvetica World" w:hAnsi="Helvetica World" w:cs="Helvetica World"/>
-          <w:b/>
-          <w:sz w:val="24"/>
-          <w:szCs w:val="24"/>
-          <w:u w:val="single"/>
-        </w:rPr>
-        <w:t>{Subject}</w:t>
-      </w:r>
-      <w:r>
-        <w:rPr>
-          <w:rFonts w:ascii="Helvetica World" w:hAnsi="Helvetica World" w:cs="Helvetica World"/>
-          <w:sz w:val="24"/>
-          <w:szCs w:val="24"/>
-          <w:lang w:val="en-GB"/>
-        </w:rPr>
-        <w:t xml:space="preserve"> Assessment </w:t>
-      </w:r>
-      <w:proofErr w:type="spellStart"/>
-      <w:r>
-        <w:rPr>
-          <w:rFonts w:ascii="Helvetica World" w:hAnsi="Helvetica World" w:cs="Helvetica World"/>
-          <w:sz w:val="24"/>
-          <w:szCs w:val="24"/>
-          <w:lang w:val="en-GB"/>
-        </w:rPr>
-        <w:t>Center</w:t>
-      </w:r>
-      <w:proofErr w:type="spellEnd"/>
-      <w:r>
-        <w:rPr>
-          <w:rFonts w:ascii="Helvetica World" w:hAnsi="Helvetica World" w:cs="Helvetica World"/>
-          <w:sz w:val="24"/>
-          <w:szCs w:val="24"/>
-          <w:lang w:val="en-GB"/>
+        <w:t xml:space="preserve">I assure that I have gained practical experience in the occupation </w:t>
+      </w:r>
+      <w:r>
+        <w:rPr>
+          <w:rFonts w:ascii="Helvetica World" w:hAnsi="Helvetica World" w:cs="Helvetica World"/>
+          <w:b/>
+          <w:sz w:val="24"/>
+          <w:szCs w:val="24"/>
+          <w:u w:val="single"/>
         </w:rPr>
         <w:t xml:space="preserve"> </w:t>
       </w:r>
@@ -1161,59 +943,7 @@
           <w:b/>
           <w:u w:val="single"/>
         </w:rPr>
-        <w:t>MELKA ADAMA TECHNICAL &amp; VOCATIONAL TRAINING INISTITUTE</w:t>
-      </w:r>
-    </w:p>
-    <w:p>
-      <w:pPr>
-        <w:spacing w:line="360" w:lineRule="auto"/>
-        <w:rPr>
-          <w:rFonts w:ascii="Helvetica World" w:hAnsi="Helvetica World" w:cs="Helvetica World"/>
-          <w:sz w:val="24"/>
-          <w:szCs w:val="24"/>
-        </w:rPr>
-      </w:pPr>
-      <w:r>
-        <w:rPr>
-          <w:rFonts w:ascii="Helvetica World" w:hAnsi="Helvetica World" w:cs="Helvetica World"/>
-          <w:sz w:val="24"/>
-          <w:szCs w:val="24"/>
-        </w:rPr>
-        <w:t xml:space="preserve">I assure that I have gained practical experience in the </w:t>
-      </w:r>
-      <w:proofErr w:type="gramStart"/>
-      <w:r>
-        <w:rPr>
-          <w:rFonts w:ascii="Helvetica World" w:hAnsi="Helvetica World" w:cs="Helvetica World"/>
-          <w:sz w:val="24"/>
-          <w:szCs w:val="24"/>
-        </w:rPr>
-        <w:t xml:space="preserve">occupation </w:t>
-      </w:r>
-      <w:r>
-        <w:rPr>
-          <w:rFonts w:ascii="Helvetica World" w:hAnsi="Helvetica World" w:cs="Helvetica World"/>
-          <w:b/>
-          <w:sz w:val="24"/>
-          <w:szCs w:val="24"/>
-          <w:u w:val="single"/>
-        </w:rPr>
-        <w:t xml:space="preserve"> </w:t>
-      </w:r>
-      <w:r>
-        <w:rPr>
-          <w:b/>
-          <w:u w:val="single"/>
-        </w:rPr>
-        <w:t>DOMESTIC</w:t>
-      </w:r>
-      <w:proofErr w:type="gramEnd"/>
-      <w:r>
-        <w:rPr>
-          <w:b/>
-          <w:u w:val="single"/>
-        </w:rPr>
-        <w:t xml:space="preserve"> WORK</w:t>
+        <w:t>DOMESTIC WORK</w:t>
       </w:r>
       <w:r>
         <w:rPr>
@@ -1373,23 +1103,13 @@
         </w:rPr>
         <w:t xml:space="preserve">   </w:t>
       </w:r>
-      <w:proofErr w:type="spellStart"/>
       <w:r>
         <w:rPr>
           <w:b/>
           <w:sz w:val="26"/>
           <w:u w:val="single"/>
         </w:rPr>
-        <w:t>Afaan</w:t>
-      </w:r>
-      <w:proofErr w:type="spellEnd"/>
-      <w:r>
-        <w:rPr>
-          <w:b/>
-          <w:sz w:val="26"/>
-          <w:u w:val="single"/>
-        </w:rPr>
-        <w:t xml:space="preserve"> Oromo/ Amhari</w:t>
+        <w:t>Afaan Oromo/ Amhari</w:t>
       </w:r>
       <w:r>
         <w:rPr>
@@ -1535,29 +1255,7 @@
           <w:szCs w:val="24"/>
           <w:u w:val="single"/>
         </w:rPr>
-        <w:t>{</w:t>
-      </w:r>
-      <w:proofErr w:type="spellStart"/>
-      <w:r>
-        <w:rPr>
-          <w:rFonts w:ascii="Helvetica World" w:hAnsi="Helvetica World" w:cs="Helvetica World"/>
-          <w:b/>
-          <w:sz w:val="24"/>
-          <w:szCs w:val="24"/>
-          <w:u w:val="single"/>
-        </w:rPr>
-        <w:t>FullName</w:t>
-      </w:r>
-      <w:proofErr w:type="spellEnd"/>
-      <w:r>
-        <w:rPr>
-          <w:rFonts w:ascii="Helvetica World" w:hAnsi="Helvetica World" w:cs="Helvetica World"/>
-          <w:b/>
-          <w:sz w:val="24"/>
-          <w:szCs w:val="24"/>
-          <w:u w:val="single"/>
-        </w:rPr>
-        <w:t>}</w:t>
+        <w:t>{FullName}</w:t>
       </w:r>
       <w:r>
         <w:rPr>
@@ -1583,14 +1281,6 @@
           <w:szCs w:val="24"/>
         </w:rPr>
         <w:tab/>
-      </w:r>
-      <w:proofErr w:type="gramStart"/>
-      <w:r>
-        <w:rPr>
-          <w:rFonts w:ascii="Helvetica World" w:hAnsi="Helvetica World" w:cs="Helvetica World"/>
-          <w:sz w:val="24"/>
-          <w:szCs w:val="24"/>
-        </w:rPr>
         <w:t xml:space="preserve">Date </w:t>
       </w:r>
       <w:r>
@@ -1610,10 +1300,8 @@
           <w:u w:val="thick"/>
           <w:lang w:eastAsia="om-Ethi-ET"/>
         </w:rPr>
-        <w:t>{</w:t>
-      </w:r>
-      <w:proofErr w:type="spellStart"/>
-      <w:proofErr w:type="gramEnd"/>
+        <w:t>{TrainingEndDate}</w:t>
+      </w:r>
       <w:r>
         <w:rPr>
           <w:rFonts w:ascii="Courier New" w:hAnsi="Courier New" w:cs="Courier New"/>
@@ -1622,27 +1310,6 @@
           <w:u w:val="thick"/>
           <w:lang w:eastAsia="om-Ethi-ET"/>
         </w:rPr>
-        <w:t>TrainingEndDate</w:t>
-      </w:r>
-      <w:proofErr w:type="spellEnd"/>
-      <w:r>
-        <w:rPr>
-          <w:rFonts w:ascii="Courier New" w:hAnsi="Courier New" w:cs="Courier New"/>
-          <w:b/>
-          <w:szCs w:val="20"/>
-          <w:u w:val="thick"/>
-          <w:lang w:eastAsia="om-Ethi-ET"/>
-        </w:rPr>
-        <w:t>}</w:t>
-      </w:r>
-      <w:r>
-        <w:rPr>
-          <w:rFonts w:ascii="Courier New" w:hAnsi="Courier New" w:cs="Courier New"/>
-          <w:b/>
-          <w:szCs w:val="20"/>
-          <w:u w:val="thick"/>
-          <w:lang w:eastAsia="om-Ethi-ET"/>
-        </w:rPr>
         <w:t xml:space="preserve"> </w:t>
       </w:r>
       <w:r>
@@ -1655,12 +1322,8 @@
       </w:r>
     </w:p>
     <w:sectPr>
-      <w:headerReference w:type="even" r:id="rId9"/>
-      <w:headerReference w:type="default" r:id="rId10"/>
-      <w:footerReference w:type="even" r:id="rId11"/>
-      <w:footerReference w:type="default" r:id="rId12"/>
-      <w:headerReference w:type="first" r:id="rId13"/>
-      <w:footerReference w:type="first" r:id="rId14"/>
+      <w:headerReference w:type="default" r:id="rId9"/>
+      <w:footerReference w:type="default" r:id="rId10"/>
       <w:pgSz w:w="12240" w:h="15840"/>
       <w:pgMar w:top="1177" w:right="460" w:bottom="1530" w:left="560" w:header="200" w:footer="660" w:gutter="0"/>
       <w:cols w:space="720"/>
@@ -1696,16 +1359,6 @@
 </file>
 
 <file path=word/footer1.xml><?xml version="1.0" encoding="utf-8"?>
-<w:ftr xmlns:wpc="http://schemas.microsoft.com/office/word/2010/wordprocessingCanvas" xmlns:mc="http://schemas.openxmlformats.org/markup-compatibility/2006" xmlns:o="urn:schemas-microsoft-com:office:office" xmlns:r="http://schemas.openxmlformats.org/officeDocument/2006/relationships" xmlns:m="http://schemas.openxmlformats.org/officeDocument/2006/math" xmlns:v="urn:schemas-microsoft-com:vml" xmlns:wp14="http://schemas.microsoft.com/office/word/2010/wordprocessingDrawing" xmlns:wp="http://schemas.openxmlformats.org/drawingml/2006/wordprocessingDrawing" xmlns:w10="urn:schemas-microsoft-com:office:word" xmlns:w="http://schemas.openxmlformats.org/wordprocessingml/2006/main" xmlns:w14="http://schemas.microsoft.com/office/word/2010/wordml" xmlns:wpg="http://schemas.microsoft.com/office/word/2010/wordprocessingGroup" xmlns:wpi="http://schemas.microsoft.com/office/word/2010/wordprocessingInk" xmlns:wne="http://schemas.microsoft.com/office/word/2006/wordml" xmlns:wps="http://schemas.microsoft.com/office/word/2010/wordprocessingShape" mc:Ignorable="w14 wp14">
-  <w:p>
-    <w:pPr>
-      <w:pStyle w:val="Footer"/>
-    </w:pPr>
-  </w:p>
-</w:ftr>
-</file>
-
-<file path=word/footer2.xml><?xml version="1.0" encoding="utf-8"?>
 <w:ftr xmlns:wpc="http://schemas.microsoft.com/office/word/2010/wordprocessingCanvas" xmlns:mc="http://schemas.openxmlformats.org/markup-compatibility/2006" xmlns:o="urn:schemas-microsoft-com:office:office" xmlns:r="http://schemas.openxmlformats.org/officeDocument/2006/relationships" xmlns:m="http://schemas.openxmlformats.org/officeDocument/2006/math" xmlns:v="urn:schemas-microsoft-com:vml" xmlns:wp14="http://schemas.microsoft.com/office/word/2010/wordprocessingDrawing" xmlns:wp="http://schemas.openxmlformats.org/drawingml/2006/wordprocessingDrawing" xmlns:w10="urn:schemas-microsoft-com:office:word" xmlns:w="http://schemas.openxmlformats.org/wordprocessingml/2006/main" xmlns:w14="http://schemas.microsoft.com/office/word/2010/wordml" xmlns:wpg="http://schemas.microsoft.com/office/word/2010/wordprocessingGroup" xmlns:wpi="http://schemas.microsoft.com/office/word/2010/wordprocessingInk" xmlns:wne="http://schemas.microsoft.com/office/word/2006/wordml" xmlns:wps="http://schemas.microsoft.com/office/word/2010/wordprocessingShape" mc:Ignorable="w14 wp14">
   <w:p>
     <w:pPr>
@@ -1818,7 +1471,7 @@
             </wp:anchor>
           </w:drawing>
         </mc:Choice>
-        <mc:Fallback xmlns:w15="http://schemas.microsoft.com/office/word/2012/wordml" xmlns:wpsCustomData="http://www.wps.cn/officeDocument/2013/wpsCustomData">
+        <mc:Fallback xmlns:wpsCustomData="http://www.wps.cn/officeDocument/2013/wpsCustomData" xmlns:w15="http://schemas.microsoft.com/office/word/2012/wordml">
           <w:pict>
             <v:shape id="Straight Arrow Connector 2" o:spid="_x0000_s1026" o:spt="32" type="#_x0000_t32" style="position:absolute;left:0pt;margin-left:-47.2pt;margin-top:5.65pt;height:0pt;width:607.9pt;z-index:251660288;mso-width-relative:page;mso-height-relative:page;" filled="f" stroked="t" coordsize="21600,21600" o:gfxdata="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">
               <v:fill on="f" focussize="0,0"/>
@@ -1846,7 +1499,6 @@
         <w:szCs w:val="18"/>
       </w:rPr>
     </w:pPr>
-    <w:proofErr w:type="spellStart"/>
     <w:r>
       <w:rPr>
         <w:rFonts w:ascii="Helvetica World" w:eastAsia="Calibri" w:hAnsi="Helvetica World" w:cs="Helvetica World"/>
@@ -1854,197 +1506,7 @@
         <w:sz w:val="18"/>
         <w:szCs w:val="18"/>
       </w:rPr>
-      <w:t>Sanada</w:t>
-    </w:r>
-    <w:proofErr w:type="spellEnd"/>
-    <w:r>
-      <w:rPr>
-        <w:rFonts w:ascii="Helvetica World" w:eastAsia="Calibri" w:hAnsi="Helvetica World" w:cs="Helvetica World"/>
-        <w:b/>
-        <w:sz w:val="18"/>
-        <w:szCs w:val="18"/>
-      </w:rPr>
-      <w:t xml:space="preserve"> </w:t>
-    </w:r>
-    <w:proofErr w:type="spellStart"/>
-    <w:r>
-      <w:rPr>
-        <w:rFonts w:ascii="Helvetica World" w:eastAsia="Calibri" w:hAnsi="Helvetica World" w:cs="Helvetica World"/>
-        <w:b/>
-        <w:sz w:val="18"/>
-        <w:szCs w:val="18"/>
-      </w:rPr>
-      <w:t>kanatti</w:t>
-    </w:r>
-    <w:proofErr w:type="spellEnd"/>
-    <w:r>
-      <w:rPr>
-        <w:rFonts w:ascii="Helvetica World" w:eastAsia="Calibri" w:hAnsi="Helvetica World" w:cs="Helvetica World"/>
-        <w:b/>
-        <w:sz w:val="18"/>
-        <w:szCs w:val="18"/>
-      </w:rPr>
-      <w:t xml:space="preserve"> </w:t>
-    </w:r>
-    <w:proofErr w:type="spellStart"/>
-    <w:r>
-      <w:rPr>
-        <w:rFonts w:ascii="Helvetica World" w:eastAsia="Calibri" w:hAnsi="Helvetica World" w:cs="Helvetica World"/>
-        <w:b/>
-        <w:sz w:val="18"/>
-        <w:szCs w:val="18"/>
-      </w:rPr>
-      <w:t>fayyadamuu</w:t>
-    </w:r>
-    <w:proofErr w:type="spellEnd"/>
-    <w:r>
-      <w:rPr>
-        <w:rFonts w:ascii="Helvetica World" w:eastAsia="Calibri" w:hAnsi="Helvetica World" w:cs="Helvetica World"/>
-        <w:b/>
-        <w:sz w:val="18"/>
-        <w:szCs w:val="18"/>
-      </w:rPr>
-      <w:t xml:space="preserve"> </w:t>
-    </w:r>
-    <w:proofErr w:type="spellStart"/>
-    <w:r>
-      <w:rPr>
-        <w:rFonts w:ascii="Helvetica World" w:eastAsia="Calibri" w:hAnsi="Helvetica World" w:cs="Helvetica World"/>
-        <w:b/>
-        <w:sz w:val="18"/>
-        <w:szCs w:val="18"/>
-      </w:rPr>
-      <w:t>keessan</w:t>
-    </w:r>
-    <w:proofErr w:type="spellEnd"/>
-    <w:r>
-      <w:rPr>
-        <w:rFonts w:ascii="Helvetica World" w:eastAsia="Calibri" w:hAnsi="Helvetica World" w:cs="Helvetica World"/>
-        <w:b/>
-        <w:sz w:val="18"/>
-        <w:szCs w:val="18"/>
-      </w:rPr>
-      <w:t xml:space="preserve"> </w:t>
-    </w:r>
-    <w:proofErr w:type="spellStart"/>
-    <w:r>
-      <w:rPr>
-        <w:rFonts w:ascii="Helvetica World" w:eastAsia="Calibri" w:hAnsi="Helvetica World" w:cs="Helvetica World"/>
-        <w:b/>
-        <w:sz w:val="18"/>
-        <w:szCs w:val="18"/>
-      </w:rPr>
-      <w:t>dura</w:t>
-    </w:r>
-    <w:proofErr w:type="spellEnd"/>
-    <w:r>
-      <w:rPr>
-        <w:rFonts w:ascii="Helvetica World" w:eastAsia="Calibri" w:hAnsi="Helvetica World" w:cs="Helvetica World"/>
-        <w:b/>
-        <w:sz w:val="18"/>
-        <w:szCs w:val="18"/>
-      </w:rPr>
-      <w:t xml:space="preserve"> </w:t>
-    </w:r>
-    <w:proofErr w:type="spellStart"/>
-    <w:r>
-      <w:rPr>
-        <w:rFonts w:ascii="Helvetica World" w:eastAsia="Calibri" w:hAnsi="Helvetica World" w:cs="Helvetica World"/>
-        <w:b/>
-        <w:sz w:val="18"/>
-        <w:szCs w:val="18"/>
-      </w:rPr>
-      <w:t>maxxansa</w:t>
-    </w:r>
-    <w:proofErr w:type="spellEnd"/>
-    <w:r>
-      <w:rPr>
-        <w:rFonts w:ascii="Helvetica World" w:eastAsia="Calibri" w:hAnsi="Helvetica World" w:cs="Helvetica World"/>
-        <w:b/>
-        <w:sz w:val="18"/>
-        <w:szCs w:val="18"/>
-      </w:rPr>
-      <w:t xml:space="preserve"> </w:t>
-    </w:r>
-    <w:proofErr w:type="spellStart"/>
-    <w:r>
-      <w:rPr>
-        <w:rFonts w:ascii="Helvetica World" w:eastAsia="Calibri" w:hAnsi="Helvetica World" w:cs="Helvetica World"/>
-        <w:b/>
-        <w:sz w:val="18"/>
-        <w:szCs w:val="18"/>
-      </w:rPr>
-      <w:t>sirrii</w:t>
-    </w:r>
-    <w:proofErr w:type="spellEnd"/>
-    <w:r>
-      <w:rPr>
-        <w:rFonts w:ascii="Helvetica World" w:eastAsia="Calibri" w:hAnsi="Helvetica World" w:cs="Helvetica World"/>
-        <w:b/>
-        <w:sz w:val="18"/>
-        <w:szCs w:val="18"/>
-      </w:rPr>
-      <w:t xml:space="preserve"> </w:t>
-    </w:r>
-    <w:proofErr w:type="spellStart"/>
-    <w:r>
-      <w:rPr>
-        <w:rFonts w:ascii="Helvetica World" w:eastAsia="Calibri" w:hAnsi="Helvetica World" w:cs="Helvetica World"/>
-        <w:b/>
-        <w:sz w:val="18"/>
-        <w:szCs w:val="18"/>
-      </w:rPr>
-      <w:t>ta'uu</w:t>
-    </w:r>
-    <w:proofErr w:type="spellEnd"/>
-    <w:r>
-      <w:rPr>
-        <w:rFonts w:ascii="Helvetica World" w:eastAsia="Calibri" w:hAnsi="Helvetica World" w:cs="Helvetica World"/>
-        <w:b/>
-        <w:sz w:val="18"/>
-        <w:szCs w:val="18"/>
-      </w:rPr>
-      <w:t xml:space="preserve"> </w:t>
-    </w:r>
-    <w:proofErr w:type="spellStart"/>
-    <w:r>
-      <w:rPr>
-        <w:rFonts w:ascii="Helvetica World" w:eastAsia="Calibri" w:hAnsi="Helvetica World" w:cs="Helvetica World"/>
-        <w:b/>
-        <w:sz w:val="18"/>
-        <w:szCs w:val="18"/>
-      </w:rPr>
-      <w:t>isaa</w:t>
-    </w:r>
-    <w:proofErr w:type="spellEnd"/>
-    <w:r>
-      <w:rPr>
-        <w:rFonts w:ascii="Helvetica World" w:eastAsia="Calibri" w:hAnsi="Helvetica World" w:cs="Helvetica World"/>
-        <w:b/>
-        <w:sz w:val="18"/>
-        <w:szCs w:val="18"/>
-      </w:rPr>
-      <w:t xml:space="preserve"> </w:t>
-    </w:r>
-    <w:proofErr w:type="spellStart"/>
-    <w:r>
-      <w:rPr>
-        <w:rFonts w:ascii="Helvetica World" w:eastAsia="Calibri" w:hAnsi="Helvetica World" w:cs="Helvetica World"/>
-        <w:b/>
-        <w:sz w:val="18"/>
-        <w:szCs w:val="18"/>
-      </w:rPr>
-      <w:t>mirkaneessa</w:t>
-    </w:r>
-    <w:proofErr w:type="spellEnd"/>
-    <w:r>
-      <w:rPr>
-        <w:rFonts w:ascii="Helvetica World" w:eastAsia="Calibri" w:hAnsi="Helvetica World" w:cs="Helvetica World"/>
-        <w:b/>
-        <w:sz w:val="18"/>
-        <w:szCs w:val="18"/>
-      </w:rPr>
-      <w:t xml:space="preserve">!!  </w:t>
+      <w:t xml:space="preserve">Sanada kanatti fayyadamuu keessan dura maxxansa sirrii ta'uu isaa mirkaneessa!!  </w:t>
     </w:r>
   </w:p>
   <w:p>
@@ -2069,16 +1531,6 @@
 </w:ftr>
 </file>
 
-<file path=word/footer3.xml><?xml version="1.0" encoding="utf-8"?>
-<w:ftr xmlns:wpc="http://schemas.microsoft.com/office/word/2010/wordprocessingCanvas" xmlns:mc="http://schemas.openxmlformats.org/markup-compatibility/2006" xmlns:o="urn:schemas-microsoft-com:office:office" xmlns:r="http://schemas.openxmlformats.org/officeDocument/2006/relationships" xmlns:m="http://schemas.openxmlformats.org/officeDocument/2006/math" xmlns:v="urn:schemas-microsoft-com:vml" xmlns:wp14="http://schemas.microsoft.com/office/word/2010/wordprocessingDrawing" xmlns:wp="http://schemas.openxmlformats.org/drawingml/2006/wordprocessingDrawing" xmlns:w10="urn:schemas-microsoft-com:office:word" xmlns:w="http://schemas.openxmlformats.org/wordprocessingml/2006/main" xmlns:w14="http://schemas.microsoft.com/office/word/2010/wordml" xmlns:wpg="http://schemas.microsoft.com/office/word/2010/wordprocessingGroup" xmlns:wpi="http://schemas.microsoft.com/office/word/2010/wordprocessingInk" xmlns:wne="http://schemas.microsoft.com/office/word/2006/wordml" xmlns:wps="http://schemas.microsoft.com/office/word/2010/wordprocessingShape" mc:Ignorable="w14 wp14">
-  <w:p>
-    <w:pPr>
-      <w:pStyle w:val="Footer"/>
-    </w:pPr>
-  </w:p>
-</w:ftr>
-</file>
-
 <file path=word/footnotes.xml><?xml version="1.0" encoding="utf-8"?>
 <w:footnotes xmlns:wpc="http://schemas.microsoft.com/office/word/2010/wordprocessingCanvas" xmlns:mc="http://schemas.openxmlformats.org/markup-compatibility/2006" xmlns:o="urn:schemas-microsoft-com:office:office" xmlns:r="http://schemas.openxmlformats.org/officeDocument/2006/relationships" xmlns:m="http://schemas.openxmlformats.org/officeDocument/2006/math" xmlns:v="urn:schemas-microsoft-com:vml" xmlns:wp14="http://schemas.microsoft.com/office/word/2010/wordprocessingDrawing" xmlns:wp="http://schemas.openxmlformats.org/drawingml/2006/wordprocessingDrawing" xmlns:w10="urn:schemas-microsoft-com:office:word" xmlns:w="http://schemas.openxmlformats.org/wordprocessingml/2006/main" xmlns:w14="http://schemas.microsoft.com/office/word/2010/wordml" xmlns:wpg="http://schemas.microsoft.com/office/word/2010/wordprocessingGroup" xmlns:wpi="http://schemas.microsoft.com/office/word/2010/wordprocessingInk" xmlns:wne="http://schemas.microsoft.com/office/word/2006/wordml" xmlns:wps="http://schemas.microsoft.com/office/word/2010/wordprocessingShape" mc:Ignorable="w14 wp14">
   <w:footnote w:type="separator" w:id="-1">
@@ -2105,16 +1557,6 @@
 </file>
 
 <file path=word/header1.xml><?xml version="1.0" encoding="utf-8"?>
-<w:hdr xmlns:wpc="http://schemas.microsoft.com/office/word/2010/wordprocessingCanvas" xmlns:mc="http://schemas.openxmlformats.org/markup-compatibility/2006" xmlns:o="urn:schemas-microsoft-com:office:office" xmlns:r="http://schemas.openxmlformats.org/officeDocument/2006/relationships" xmlns:m="http://schemas.openxmlformats.org/officeDocument/2006/math" xmlns:v="urn:schemas-microsoft-com:vml" xmlns:wp14="http://schemas.microsoft.com/office/word/2010/wordprocessingDrawing" xmlns:wp="http://schemas.openxmlformats.org/drawingml/2006/wordprocessingDrawing" xmlns:w10="urn:schemas-microsoft-com:office:word" xmlns:w="http://schemas.openxmlformats.org/wordprocessingml/2006/main" xmlns:w14="http://schemas.microsoft.com/office/word/2010/wordml" xmlns:wpg="http://schemas.microsoft.com/office/word/2010/wordprocessingGroup" xmlns:wpi="http://schemas.microsoft.com/office/word/2010/wordprocessingInk" xmlns:wne="http://schemas.microsoft.com/office/word/2006/wordml" xmlns:wps="http://schemas.microsoft.com/office/word/2010/wordprocessingShape" mc:Ignorable="w14 wp14">
-  <w:p>
-    <w:pPr>
-      <w:pStyle w:val="Header"/>
-    </w:pPr>
-  </w:p>
-</w:hdr>
-</file>
-
-<file path=word/header2.xml><?xml version="1.0" encoding="utf-8"?>
 <w:hdr xmlns:wpc="http://schemas.microsoft.com/office/word/2010/wordprocessingCanvas" xmlns:mc="http://schemas.openxmlformats.org/markup-compatibility/2006" xmlns:o="urn:schemas-microsoft-com:office:office" xmlns:r="http://schemas.openxmlformats.org/officeDocument/2006/relationships" xmlns:m="http://schemas.openxmlformats.org/officeDocument/2006/math" xmlns:v="urn:schemas-microsoft-com:vml" xmlns:wp14="http://schemas.microsoft.com/office/word/2010/wordprocessingDrawing" xmlns:wp="http://schemas.openxmlformats.org/drawingml/2006/wordprocessingDrawing" xmlns:w10="urn:schemas-microsoft-com:office:word" xmlns:w="http://schemas.openxmlformats.org/wordprocessingml/2006/main" xmlns:w14="http://schemas.microsoft.com/office/word/2010/wordml" xmlns:wpg="http://schemas.microsoft.com/office/word/2010/wordprocessingGroup" xmlns:wpi="http://schemas.microsoft.com/office/word/2010/wordprocessingInk" xmlns:wne="http://schemas.microsoft.com/office/word/2006/wordml" xmlns:wps="http://schemas.microsoft.com/office/word/2010/wordprocessingShape" mc:Ignorable="w14 wp14">
   <w:p>
     <w:pPr>
@@ -2199,7 +1641,7 @@
               <w:lang w:val="om-Ethi-ET" w:eastAsia="om-Ethi-ET"/>
             </w:rPr>
             <w:drawing>
-              <wp:anchor distT="0" distB="0" distL="114300" distR="114300" simplePos="0" relativeHeight="251657216" behindDoc="0" locked="0" layoutInCell="1" allowOverlap="1">
+              <wp:anchor distT="0" distB="0" distL="114300" distR="114300" simplePos="0" relativeHeight="251657216" behindDoc="0" locked="0" layoutInCell="1" allowOverlap="1" wp14:anchorId="6C4F7DB0" wp14:editId="4095ABD8">
                 <wp:simplePos x="0" y="0"/>
                 <wp:positionH relativeFrom="margin">
                   <wp:posOffset>7620</wp:posOffset>
@@ -2275,138 +1717,83 @@
         </w:tcPr>
         <w:p>
           <w:pPr>
-            <w:pStyle w:val="Header"/>
-            <w:tabs>
-              <w:tab w:val="clear" w:pos="4680"/>
-              <w:tab w:val="clear" w:pos="9360"/>
-              <w:tab w:val="center" w:pos="4320"/>
-              <w:tab w:val="right" w:pos="8640"/>
-            </w:tabs>
+            <w:rPr>
+              <w:rFonts w:ascii="Times New Roman" w:eastAsia="Times New Roman" w:hAnsi="Times New Roman" w:cs="Times New Roman"/>
+              <w:sz w:val="24"/>
+              <w:szCs w:val="24"/>
+              <w:lang w:val="om-Ethi-ET" w:eastAsia="om-Ethi-ET"/>
+            </w:rPr>
+          </w:pPr>
+          <w:r>
             <w:rPr>
               <w:rFonts w:ascii="Helvetica World" w:eastAsia="Times New Roman" w:hAnsi="Helvetica World" w:cs="Helvetica World"/>
               <w:sz w:val="20"/>
               <w:szCs w:val="20"/>
             </w:rPr>
-          </w:pPr>
-          <w:proofErr w:type="spellStart"/>
+            <w:t>Maqaa Mana Hojii/</w:t>
+          </w:r>
           <w:r>
             <w:rPr>
               <w:rFonts w:ascii="Helvetica World" w:eastAsia="Times New Roman" w:hAnsi="Helvetica World" w:cs="Helvetica World"/>
               <w:sz w:val="20"/>
               <w:szCs w:val="20"/>
             </w:rPr>
-            <w:t>Maqaa</w:t>
-          </w:r>
-          <w:proofErr w:type="spellEnd"/>
+            <w:t xml:space="preserve">  </w:t>
+          </w:r>
+          <w:r>
+            <w:rPr>
+              <w:b/>
+            </w:rPr>
+            <w:t xml:space="preserve">      </w:t>
+          </w:r>
+          <w:r>
+            <w:rPr>
+              <w:b/>
+            </w:rPr>
+            <w:fldChar w:fldCharType="begin"/>
+          </w:r>
+          <w:r>
+            <w:rPr>
+              <w:rFonts w:ascii="Times New Roman" w:eastAsia="Times New Roman" w:hAnsi="Times New Roman" w:cs="Times New Roman"/>
+              <w:sz w:val="24"/>
+              <w:szCs w:val="24"/>
+              <w:lang w:val="om-Ethi-ET" w:eastAsia="om-Ethi-ET"/>
+            </w:rPr>
+            <w:instrText>company_name_oro</w:instrText>
+          </w:r>
+          <w:r>
+            <w:rPr>
+              <w:b/>
+            </w:rPr>
+            <w:fldChar w:fldCharType="end"/>
+          </w:r>
+          <w:r>
+            <w:rPr>
+              <w:b/>
+            </w:rPr>
+            <w:br/>
+          </w:r>
           <w:r>
             <w:rPr>
               <w:rFonts w:ascii="Helvetica World" w:eastAsia="Times New Roman" w:hAnsi="Helvetica World" w:cs="Helvetica World"/>
               <w:sz w:val="20"/>
               <w:szCs w:val="20"/>
             </w:rPr>
-            <w:t xml:space="preserve"> </w:t>
-          </w:r>
-          <w:proofErr w:type="spellStart"/>
+            <w:t xml:space="preserve">Company Name </w:t>
+          </w:r>
           <w:r>
             <w:rPr>
               <w:rFonts w:ascii="Helvetica World" w:eastAsia="Times New Roman" w:hAnsi="Helvetica World" w:cs="Helvetica World"/>
               <w:sz w:val="20"/>
               <w:szCs w:val="20"/>
             </w:rPr>
-            <w:t>Mana</w:t>
-          </w:r>
-          <w:proofErr w:type="spellEnd"/>
-          <w:r>
-            <w:rPr>
-              <w:rFonts w:ascii="Helvetica World" w:eastAsia="Times New Roman" w:hAnsi="Helvetica World" w:cs="Helvetica World"/>
-              <w:sz w:val="20"/>
-              <w:szCs w:val="20"/>
-            </w:rPr>
-            <w:t xml:space="preserve"> </w:t>
-          </w:r>
-          <w:proofErr w:type="spellStart"/>
-          <w:r>
-            <w:rPr>
-              <w:rFonts w:ascii="Helvetica World" w:eastAsia="Times New Roman" w:hAnsi="Helvetica World" w:cs="Helvetica World"/>
-              <w:sz w:val="20"/>
-              <w:szCs w:val="20"/>
-            </w:rPr>
-            <w:t>Hojii</w:t>
-          </w:r>
-          <w:proofErr w:type="spellEnd"/>
-          <w:r>
-            <w:rPr>
-              <w:rFonts w:ascii="Helvetica World" w:eastAsia="Times New Roman" w:hAnsi="Helvetica World" w:cs="Helvetica World"/>
-              <w:sz w:val="20"/>
-              <w:szCs w:val="20"/>
-            </w:rPr>
-            <w:t>/</w:t>
-          </w:r>
-          <w:r>
-            <w:rPr>
-              <w:rFonts w:ascii="Helvetica World" w:eastAsia="Times New Roman" w:hAnsi="Helvetica World" w:cs="Helvetica World"/>
-              <w:sz w:val="20"/>
-              <w:szCs w:val="20"/>
-            </w:rPr>
-            <w:t xml:space="preserve">  </w:t>
+            <w:t xml:space="preserve">      </w:t>
           </w:r>
           <w:r>
             <w:rPr>
               <w:b/>
             </w:rPr>
-            <w:t xml:space="preserve">       </w:t>
-          </w:r>
-          <w:r>
-            <w:rPr>
-              <w:b/>
-              <w:u w:val="single"/>
-            </w:rPr>
-            <w:t>MELKA ADAMA TECHNICAL</w:t>
-          </w:r>
-        </w:p>
-        <w:p>
-          <w:pPr>
-            <w:pStyle w:val="Header"/>
-            <w:tabs>
-              <w:tab w:val="clear" w:pos="4680"/>
-              <w:tab w:val="clear" w:pos="9360"/>
-              <w:tab w:val="center" w:pos="4320"/>
-              <w:tab w:val="right" w:pos="8640"/>
-            </w:tabs>
-            <w:rPr>
-              <w:rFonts w:ascii="Helvetica World" w:eastAsia="Times New Roman" w:hAnsi="Helvetica World" w:cs="Helvetica World"/>
-              <w:sz w:val="20"/>
-              <w:szCs w:val="20"/>
-            </w:rPr>
-          </w:pPr>
-          <w:r>
-            <w:rPr>
-              <w:rFonts w:ascii="Helvetica World" w:eastAsia="Times New Roman" w:hAnsi="Helvetica World" w:cs="Helvetica World"/>
-              <w:sz w:val="20"/>
-              <w:szCs w:val="20"/>
-            </w:rPr>
-            <w:t xml:space="preserve">Company Name </w:t>
-          </w:r>
-          <w:r>
-            <w:rPr>
-              <w:rFonts w:ascii="Helvetica World" w:eastAsia="Times New Roman" w:hAnsi="Helvetica World" w:cs="Helvetica World"/>
-              <w:sz w:val="20"/>
-              <w:szCs w:val="20"/>
-            </w:rPr>
-            <w:t xml:space="preserve">      </w:t>
-          </w:r>
-          <w:r>
-            <w:rPr>
-              <w:b/>
-            </w:rPr>
-            <w:t xml:space="preserve">       </w:t>
-          </w:r>
-          <w:r>
-            <w:rPr>
-              <w:b/>
-              <w:u w:val="single"/>
-            </w:rPr>
-            <w:t>&amp; VOCATIONAL TRAINING INISTITUTE</w:t>
+            <w:t xml:space="preserve">    </w:t>
           </w:r>
         </w:p>
         <w:p>
@@ -2421,7 +1808,6 @@
               <w:szCs w:val="26"/>
             </w:rPr>
           </w:pPr>
-          <w:proofErr w:type="spellStart"/>
           <w:r>
             <w:rPr>
               <w:rFonts w:ascii="Helvetica World" w:eastAsia="SimSun" w:hAnsi="Helvetica World" w:cs="Helvetica World"/>
@@ -2430,10 +1816,13 @@
               <w:sz w:val="26"/>
               <w:szCs w:val="26"/>
             </w:rPr>
-            <w:t>Ejensii</w:t>
-          </w:r>
-          <w:proofErr w:type="spellEnd"/>
-          <w:r>
+            <w:t>Ejensii Mirkaneessa Gahumsa Ogummaa Oromiyaa</w:t>
+          </w:r>
+        </w:p>
+        <w:p>
+          <w:pPr>
+            <w:spacing w:after="0" w:line="240" w:lineRule="auto"/>
+            <w:jc w:val="center"/>
             <w:rPr>
               <w:rFonts w:ascii="Helvetica World" w:eastAsia="SimSun" w:hAnsi="Helvetica World" w:cs="Helvetica World"/>
               <w:b/>
@@ -2441,9 +1830,30 @@
               <w:sz w:val="26"/>
               <w:szCs w:val="26"/>
             </w:rPr>
-            <w:t xml:space="preserve"> </w:t>
-          </w:r>
-          <w:proofErr w:type="spellStart"/>
+          </w:pPr>
+          <w:r>
+            <w:rPr>
+              <w:rFonts w:ascii="Noto Sans Ethiopic" w:eastAsia="SimSun" w:hAnsi="Noto Sans Ethiopic" w:cs="Noto Sans Ethiopic"/>
+              <w:b/>
+              <w:color w:val="2E74B5" w:themeColor="accent1" w:themeShade="BF"/>
+              <w:sz w:val="26"/>
+              <w:szCs w:val="26"/>
+            </w:rPr>
+            <w:t>የኦሮሚያ የሙያ ብቃት ማረጋገጫ ኤጄንሲ</w:t>
+          </w:r>
+        </w:p>
+        <w:p>
+          <w:pPr>
+            <w:spacing w:after="0" w:line="240" w:lineRule="auto"/>
+            <w:jc w:val="center"/>
+            <w:rPr>
+              <w:rFonts w:ascii="Helvetica World" w:eastAsia="Times New Roman" w:hAnsi="Helvetica World" w:cs="Helvetica World"/>
+              <w:b/>
+              <w:color w:val="202124"/>
+              <w:sz w:val="28"/>
+              <w:szCs w:val="28"/>
+            </w:rPr>
+          </w:pPr>
           <w:r>
             <w:rPr>
               <w:rFonts w:ascii="Helvetica World" w:eastAsia="SimSun" w:hAnsi="Helvetica World" w:cs="Helvetica World"/>
@@ -2452,222 +1862,7 @@
               <w:sz w:val="26"/>
               <w:szCs w:val="26"/>
             </w:rPr>
-            <w:t>Mirkaneessa</w:t>
-          </w:r>
-          <w:proofErr w:type="spellEnd"/>
-          <w:r>
-            <w:rPr>
-              <w:rFonts w:ascii="Helvetica World" w:eastAsia="SimSun" w:hAnsi="Helvetica World" w:cs="Helvetica World"/>
-              <w:b/>
-              <w:color w:val="2E74B5" w:themeColor="accent1" w:themeShade="BF"/>
-              <w:sz w:val="26"/>
-              <w:szCs w:val="26"/>
-            </w:rPr>
-            <w:t xml:space="preserve"> </w:t>
-          </w:r>
-          <w:proofErr w:type="spellStart"/>
-          <w:r>
-            <w:rPr>
-              <w:rFonts w:ascii="Helvetica World" w:eastAsia="SimSun" w:hAnsi="Helvetica World" w:cs="Helvetica World"/>
-              <w:b/>
-              <w:color w:val="2E74B5" w:themeColor="accent1" w:themeShade="BF"/>
-              <w:sz w:val="26"/>
-              <w:szCs w:val="26"/>
-            </w:rPr>
-            <w:t>Gahumsa</w:t>
-          </w:r>
-          <w:proofErr w:type="spellEnd"/>
-          <w:r>
-            <w:rPr>
-              <w:rFonts w:ascii="Helvetica World" w:eastAsia="SimSun" w:hAnsi="Helvetica World" w:cs="Helvetica World"/>
-              <w:b/>
-              <w:color w:val="2E74B5" w:themeColor="accent1" w:themeShade="BF"/>
-              <w:sz w:val="26"/>
-              <w:szCs w:val="26"/>
-            </w:rPr>
-            <w:t xml:space="preserve"> </w:t>
-          </w:r>
-          <w:proofErr w:type="spellStart"/>
-          <w:r>
-            <w:rPr>
-              <w:rFonts w:ascii="Helvetica World" w:eastAsia="SimSun" w:hAnsi="Helvetica World" w:cs="Helvetica World"/>
-              <w:b/>
-              <w:color w:val="2E74B5" w:themeColor="accent1" w:themeShade="BF"/>
-              <w:sz w:val="26"/>
-              <w:szCs w:val="26"/>
-            </w:rPr>
-            <w:t>Ogummaa</w:t>
-          </w:r>
-          <w:proofErr w:type="spellEnd"/>
-          <w:r>
-            <w:rPr>
-              <w:rFonts w:ascii="Helvetica World" w:eastAsia="SimSun" w:hAnsi="Helvetica World" w:cs="Helvetica World"/>
-              <w:b/>
-              <w:color w:val="2E74B5" w:themeColor="accent1" w:themeShade="BF"/>
-              <w:sz w:val="26"/>
-              <w:szCs w:val="26"/>
-            </w:rPr>
-            <w:t xml:space="preserve"> </w:t>
-          </w:r>
-          <w:proofErr w:type="spellStart"/>
-          <w:r>
-            <w:rPr>
-              <w:rFonts w:ascii="Helvetica World" w:eastAsia="SimSun" w:hAnsi="Helvetica World" w:cs="Helvetica World"/>
-              <w:b/>
-              <w:color w:val="2E74B5" w:themeColor="accent1" w:themeShade="BF"/>
-              <w:sz w:val="26"/>
-              <w:szCs w:val="26"/>
-            </w:rPr>
-            <w:t>Oromiyaa</w:t>
-          </w:r>
-          <w:proofErr w:type="spellEnd"/>
-        </w:p>
-        <w:p>
-          <w:pPr>
-            <w:spacing w:after="0" w:line="240" w:lineRule="auto"/>
-            <w:jc w:val="center"/>
-            <w:rPr>
-              <w:rFonts w:ascii="Helvetica World" w:eastAsia="SimSun" w:hAnsi="Helvetica World" w:cs="Helvetica World"/>
-              <w:b/>
-              <w:color w:val="2E74B5" w:themeColor="accent1" w:themeShade="BF"/>
-              <w:sz w:val="26"/>
-              <w:szCs w:val="26"/>
-            </w:rPr>
-          </w:pPr>
-          <w:proofErr w:type="spellStart"/>
-          <w:r>
-            <w:rPr>
-              <w:rFonts w:ascii="Noto Sans Ethiopic" w:eastAsia="SimSun" w:hAnsi="Noto Sans Ethiopic" w:cs="Noto Sans Ethiopic"/>
-              <w:b/>
-              <w:color w:val="2E74B5" w:themeColor="accent1" w:themeShade="BF"/>
-              <w:sz w:val="26"/>
-              <w:szCs w:val="26"/>
-            </w:rPr>
-            <w:t>የኦሮሚያ</w:t>
-          </w:r>
-          <w:proofErr w:type="spellEnd"/>
-          <w:r>
-            <w:rPr>
-              <w:rFonts w:ascii="Noto Sans Ethiopic" w:eastAsia="SimSun" w:hAnsi="Noto Sans Ethiopic" w:cs="Noto Sans Ethiopic"/>
-              <w:b/>
-              <w:color w:val="2E74B5" w:themeColor="accent1" w:themeShade="BF"/>
-              <w:sz w:val="26"/>
-              <w:szCs w:val="26"/>
-            </w:rPr>
-            <w:t xml:space="preserve"> </w:t>
-          </w:r>
-          <w:proofErr w:type="spellStart"/>
-          <w:r>
-            <w:rPr>
-              <w:rFonts w:ascii="Noto Sans Ethiopic" w:eastAsia="SimSun" w:hAnsi="Noto Sans Ethiopic" w:cs="Noto Sans Ethiopic"/>
-              <w:b/>
-              <w:color w:val="2E74B5" w:themeColor="accent1" w:themeShade="BF"/>
-              <w:sz w:val="26"/>
-              <w:szCs w:val="26"/>
-            </w:rPr>
-            <w:t>የሙያ</w:t>
-          </w:r>
-          <w:proofErr w:type="spellEnd"/>
-          <w:r>
-            <w:rPr>
-              <w:rFonts w:ascii="Noto Sans Ethiopic" w:eastAsia="SimSun" w:hAnsi="Noto Sans Ethiopic" w:cs="Noto Sans Ethiopic"/>
-              <w:b/>
-              <w:color w:val="2E74B5" w:themeColor="accent1" w:themeShade="BF"/>
-              <w:sz w:val="26"/>
-              <w:szCs w:val="26"/>
-            </w:rPr>
-            <w:t xml:space="preserve"> </w:t>
-          </w:r>
-          <w:proofErr w:type="spellStart"/>
-          <w:r>
-            <w:rPr>
-              <w:rFonts w:ascii="Noto Sans Ethiopic" w:eastAsia="SimSun" w:hAnsi="Noto Sans Ethiopic" w:cs="Noto Sans Ethiopic"/>
-              <w:b/>
-              <w:color w:val="2E74B5" w:themeColor="accent1" w:themeShade="BF"/>
-              <w:sz w:val="26"/>
-              <w:szCs w:val="26"/>
-            </w:rPr>
-            <w:t>ብቃት</w:t>
-          </w:r>
-          <w:proofErr w:type="spellEnd"/>
-          <w:r>
-            <w:rPr>
-              <w:rFonts w:ascii="Noto Sans Ethiopic" w:eastAsia="SimSun" w:hAnsi="Noto Sans Ethiopic" w:cs="Noto Sans Ethiopic"/>
-              <w:b/>
-              <w:color w:val="2E74B5" w:themeColor="accent1" w:themeShade="BF"/>
-              <w:sz w:val="26"/>
-              <w:szCs w:val="26"/>
-            </w:rPr>
-            <w:t xml:space="preserve"> </w:t>
-          </w:r>
-          <w:proofErr w:type="spellStart"/>
-          <w:r>
-            <w:rPr>
-              <w:rFonts w:ascii="Noto Sans Ethiopic" w:eastAsia="SimSun" w:hAnsi="Noto Sans Ethiopic" w:cs="Noto Sans Ethiopic"/>
-              <w:b/>
-              <w:color w:val="2E74B5" w:themeColor="accent1" w:themeShade="BF"/>
-              <w:sz w:val="26"/>
-              <w:szCs w:val="26"/>
-            </w:rPr>
-            <w:t>ማረጋገጫ</w:t>
-          </w:r>
-          <w:proofErr w:type="spellEnd"/>
-          <w:r>
-            <w:rPr>
-              <w:rFonts w:ascii="Noto Sans Ethiopic" w:eastAsia="SimSun" w:hAnsi="Noto Sans Ethiopic" w:cs="Noto Sans Ethiopic"/>
-              <w:b/>
-              <w:color w:val="2E74B5" w:themeColor="accent1" w:themeShade="BF"/>
-              <w:sz w:val="26"/>
-              <w:szCs w:val="26"/>
-            </w:rPr>
-            <w:t xml:space="preserve"> </w:t>
-          </w:r>
-          <w:proofErr w:type="spellStart"/>
-          <w:r>
-            <w:rPr>
-              <w:rFonts w:ascii="Noto Sans Ethiopic" w:eastAsia="SimSun" w:hAnsi="Noto Sans Ethiopic" w:cs="Noto Sans Ethiopic"/>
-              <w:b/>
-              <w:color w:val="2E74B5" w:themeColor="accent1" w:themeShade="BF"/>
-              <w:sz w:val="26"/>
-              <w:szCs w:val="26"/>
-            </w:rPr>
-            <w:t>ኤጄንሲ</w:t>
-          </w:r>
-          <w:proofErr w:type="spellEnd"/>
-        </w:p>
-        <w:p>
-          <w:pPr>
-            <w:spacing w:after="0" w:line="240" w:lineRule="auto"/>
-            <w:jc w:val="center"/>
-            <w:rPr>
-              <w:rFonts w:ascii="Helvetica World" w:eastAsia="Times New Roman" w:hAnsi="Helvetica World" w:cs="Helvetica World"/>
-              <w:b/>
-              <w:color w:val="202124"/>
-              <w:sz w:val="28"/>
-              <w:szCs w:val="28"/>
-            </w:rPr>
-          </w:pPr>
-          <w:proofErr w:type="spellStart"/>
-          <w:r>
-            <w:rPr>
-              <w:rFonts w:ascii="Helvetica World" w:eastAsia="SimSun" w:hAnsi="Helvetica World" w:cs="Helvetica World"/>
-              <w:b/>
-              <w:color w:val="2E74B5" w:themeColor="accent1" w:themeShade="BF"/>
-              <w:sz w:val="26"/>
-              <w:szCs w:val="26"/>
-            </w:rPr>
-            <w:t>Oromia</w:t>
-          </w:r>
-          <w:proofErr w:type="spellEnd"/>
-          <w:r>
-            <w:rPr>
-              <w:rFonts w:ascii="Helvetica World" w:eastAsia="SimSun" w:hAnsi="Helvetica World" w:cs="Helvetica World"/>
-              <w:b/>
-              <w:color w:val="2E74B5" w:themeColor="accent1" w:themeShade="BF"/>
-              <w:sz w:val="26"/>
-              <w:szCs w:val="26"/>
-            </w:rPr>
-            <w:t xml:space="preserve"> Occupational Competence Assurance Agency</w:t>
+            <w:t>Oromia Occupational Competence Assurance Agency</w:t>
           </w:r>
         </w:p>
       </w:tc>
@@ -2691,23 +1886,13 @@
               <w:szCs w:val="20"/>
             </w:rPr>
           </w:pPr>
-          <w:proofErr w:type="spellStart"/>
           <w:r>
             <w:rPr>
               <w:rFonts w:ascii="Helvetica World" w:eastAsia="Times New Roman" w:hAnsi="Helvetica World" w:cs="Helvetica World"/>
               <w:sz w:val="20"/>
               <w:szCs w:val="20"/>
             </w:rPr>
-            <w:t>Lakk.Sanadaa</w:t>
-          </w:r>
-          <w:proofErr w:type="spellEnd"/>
-          <w:r>
-            <w:rPr>
-              <w:rFonts w:ascii="Helvetica World" w:eastAsia="Times New Roman" w:hAnsi="Helvetica World" w:cs="Helvetica World"/>
-              <w:sz w:val="20"/>
-              <w:szCs w:val="20"/>
-            </w:rPr>
-            <w:t>/</w:t>
+            <w:t>Lakk.Sanadaa/</w:t>
           </w:r>
         </w:p>
         <w:p>
@@ -2914,25 +2099,7 @@
               <w:sz w:val="20"/>
               <w:szCs w:val="20"/>
             </w:rPr>
-            <w:t>Mata-</w:t>
-          </w:r>
-          <w:proofErr w:type="spellStart"/>
-          <w:r>
-            <w:rPr>
-              <w:rFonts w:ascii="Helvetica World" w:eastAsia="Times New Roman" w:hAnsi="Helvetica World" w:cs="Helvetica World"/>
-              <w:sz w:val="20"/>
-              <w:szCs w:val="20"/>
-            </w:rPr>
-            <w:t>duree</w:t>
-          </w:r>
-          <w:proofErr w:type="spellEnd"/>
-          <w:r>
-            <w:rPr>
-              <w:rFonts w:ascii="Helvetica World" w:eastAsia="Times New Roman" w:hAnsi="Helvetica World" w:cs="Helvetica World"/>
-              <w:sz w:val="20"/>
-              <w:szCs w:val="20"/>
-            </w:rPr>
-            <w:t>/Title</w:t>
+            <w:t>Mata-duree/Title</w:t>
           </w:r>
           <w:r>
             <w:rPr>
@@ -2943,7 +2110,6 @@
             </w:rPr>
             <w:t xml:space="preserve">                          </w:t>
           </w:r>
-          <w:proofErr w:type="spellStart"/>
           <w:r>
             <w:rPr>
               <w:rFonts w:ascii="Helvetica World" w:eastAsia="Times New Roman" w:hAnsi="Helvetica World" w:cs="Helvetica World"/>
@@ -2952,75 +2118,8 @@
               <w:sz w:val="24"/>
               <w:szCs w:val="24"/>
             </w:rPr>
-            <w:t>Unka</w:t>
-          </w:r>
-          <w:proofErr w:type="spellEnd"/>
-          <w:r>
-            <w:rPr>
-              <w:rFonts w:ascii="Helvetica World" w:eastAsia="Times New Roman" w:hAnsi="Helvetica World" w:cs="Helvetica World"/>
-              <w:b/>
-              <w:bCs/>
-              <w:sz w:val="24"/>
-              <w:szCs w:val="24"/>
-            </w:rPr>
-            <w:t xml:space="preserve"> </w:t>
-          </w:r>
-          <w:proofErr w:type="spellStart"/>
-          <w:r>
-            <w:rPr>
-              <w:rFonts w:ascii="Helvetica World" w:eastAsia="Times New Roman" w:hAnsi="Helvetica World" w:cs="Helvetica World"/>
-              <w:b/>
-              <w:bCs/>
-              <w:sz w:val="24"/>
-              <w:szCs w:val="24"/>
-            </w:rPr>
-            <w:t>Iyyannoo</w:t>
-          </w:r>
-          <w:proofErr w:type="spellEnd"/>
-          <w:r>
-            <w:rPr>
-              <w:rFonts w:ascii="Helvetica World" w:eastAsia="Times New Roman" w:hAnsi="Helvetica World" w:cs="Helvetica World"/>
-              <w:b/>
-              <w:bCs/>
-              <w:sz w:val="24"/>
-              <w:szCs w:val="24"/>
-            </w:rPr>
-            <w:t xml:space="preserve"> </w:t>
-          </w:r>
-          <w:proofErr w:type="spellStart"/>
-          <w:r>
-            <w:rPr>
-              <w:rFonts w:ascii="Helvetica World" w:eastAsia="Times New Roman" w:hAnsi="Helvetica World" w:cs="Helvetica World"/>
-              <w:b/>
-              <w:bCs/>
-              <w:sz w:val="24"/>
-              <w:szCs w:val="24"/>
-            </w:rPr>
-            <w:t>Madaallii</w:t>
-          </w:r>
-          <w:proofErr w:type="spellEnd"/>
-          <w:r>
-            <w:rPr>
-              <w:rFonts w:ascii="Helvetica World" w:eastAsia="Times New Roman" w:hAnsi="Helvetica World" w:cs="Helvetica World"/>
-              <w:b/>
-              <w:bCs/>
-              <w:sz w:val="24"/>
-              <w:szCs w:val="24"/>
-            </w:rPr>
-            <w:t xml:space="preserve"> </w:t>
-          </w:r>
-          <w:proofErr w:type="spellStart"/>
-          <w:r>
-            <w:rPr>
-              <w:rFonts w:ascii="Helvetica World" w:eastAsia="Times New Roman" w:hAnsi="Helvetica World" w:cs="Helvetica World"/>
-              <w:b/>
-              <w:bCs/>
-              <w:sz w:val="24"/>
-              <w:szCs w:val="24"/>
-            </w:rPr>
-            <w:t>Madaalamaa</w:t>
-          </w:r>
-          <w:proofErr w:type="spellEnd"/>
+            <w:t>Unka Iyyannoo Madaallii Madaalamaa</w:t>
+          </w:r>
         </w:p>
         <w:p>
           <w:pPr>
@@ -3073,23 +2172,13 @@
               <w:szCs w:val="20"/>
             </w:rPr>
           </w:pPr>
-          <w:proofErr w:type="spellStart"/>
           <w:r>
             <w:rPr>
               <w:rFonts w:ascii="Helvetica World" w:eastAsia="Times New Roman" w:hAnsi="Helvetica World" w:cs="Helvetica World"/>
               <w:sz w:val="20"/>
               <w:szCs w:val="20"/>
             </w:rPr>
-            <w:t>Lakk.Maxxansaa</w:t>
-          </w:r>
-          <w:proofErr w:type="spellEnd"/>
-          <w:r>
-            <w:rPr>
-              <w:rFonts w:ascii="Helvetica World" w:eastAsia="Times New Roman" w:hAnsi="Helvetica World" w:cs="Helvetica World"/>
-              <w:sz w:val="20"/>
-              <w:szCs w:val="20"/>
-            </w:rPr>
-            <w:t>/Issue N</w:t>
+            <w:t>Lakk.Maxxansaa/Issue N</w:t>
           </w:r>
           <w:r>
             <w:rPr>
@@ -3158,23 +2247,13 @@
               <w:szCs w:val="20"/>
             </w:rPr>
           </w:pPr>
-          <w:proofErr w:type="spellStart"/>
           <w:r>
             <w:rPr>
               <w:rFonts w:ascii="Helvetica World" w:eastAsia="Times New Roman" w:hAnsi="Helvetica World" w:cs="Helvetica World"/>
               <w:sz w:val="20"/>
               <w:szCs w:val="20"/>
             </w:rPr>
-            <w:t>Fuula</w:t>
-          </w:r>
-          <w:proofErr w:type="spellEnd"/>
-          <w:r>
-            <w:rPr>
-              <w:rFonts w:ascii="Helvetica World" w:eastAsia="Times New Roman" w:hAnsi="Helvetica World" w:cs="Helvetica World"/>
-              <w:sz w:val="20"/>
-              <w:szCs w:val="20"/>
-            </w:rPr>
-            <w:t>/Page N</w:t>
+            <w:t>Fuula/Page N</w:t>
           </w:r>
           <w:r>
             <w:rPr>
@@ -3219,7 +2298,7 @@
             <mc:AlternateContent>
               <mc:Choice Requires="wps">
                 <w:drawing>
-                  <wp:anchor distT="0" distB="0" distL="114300" distR="114300" simplePos="0" relativeHeight="251658240" behindDoc="0" locked="0" layoutInCell="1" allowOverlap="1">
+                  <wp:anchor distT="0" distB="0" distL="114300" distR="114300" simplePos="0" relativeHeight="251658240" behindDoc="0" locked="0" layoutInCell="1" allowOverlap="1" wp14:anchorId="27E46D2B" wp14:editId="013CC299">
                     <wp:simplePos x="0" y="0"/>
                     <wp:positionH relativeFrom="margin">
                       <wp:posOffset>137795</wp:posOffset>
@@ -3485,16 +2564,6 @@
       <w:rPr>
         <w:sz w:val="10"/>
       </w:rPr>
-    </w:pPr>
-  </w:p>
-</w:hdr>
-</file>
-
-<file path=word/header3.xml><?xml version="1.0" encoding="utf-8"?>
-<w:hdr xmlns:wpc="http://schemas.microsoft.com/office/word/2010/wordprocessingCanvas" xmlns:mc="http://schemas.openxmlformats.org/markup-compatibility/2006" xmlns:o="urn:schemas-microsoft-com:office:office" xmlns:r="http://schemas.openxmlformats.org/officeDocument/2006/relationships" xmlns:m="http://schemas.openxmlformats.org/officeDocument/2006/math" xmlns:v="urn:schemas-microsoft-com:vml" xmlns:wp14="http://schemas.microsoft.com/office/word/2010/wordprocessingDrawing" xmlns:wp="http://schemas.openxmlformats.org/drawingml/2006/wordprocessingDrawing" xmlns:w10="urn:schemas-microsoft-com:office:word" xmlns:w="http://schemas.openxmlformats.org/wordprocessingml/2006/main" xmlns:w14="http://schemas.microsoft.com/office/word/2010/wordml" xmlns:wpg="http://schemas.microsoft.com/office/word/2010/wordprocessingGroup" xmlns:wpi="http://schemas.microsoft.com/office/word/2010/wordprocessingInk" xmlns:wne="http://schemas.microsoft.com/office/word/2006/wordml" xmlns:wps="http://schemas.microsoft.com/office/word/2010/wordprocessingShape" mc:Ignorable="w14 wp14">
-  <w:p>
-    <w:pPr>
-      <w:pStyle w:val="Header"/>
     </w:pPr>
   </w:p>
 </w:hdr>
@@ -4381,7 +3450,7 @@
 </file>
 
 <file path=customXml/itemProps2.xml><?xml version="1.0" encoding="utf-8"?>
-<ds:datastoreItem xmlns:ds="http://schemas.openxmlformats.org/officeDocument/2006/customXml" ds:itemID="{90FDAFA2-CBCD-419D-B11F-0940407F7315}">
+<ds:datastoreItem xmlns:ds="http://schemas.openxmlformats.org/officeDocument/2006/customXml" ds:itemID="{E2657E85-AF62-45DA-A7A7-5F03B05133B0}">
   <ds:schemaRefs>
     <ds:schemaRef ds:uri="http://schemas.openxmlformats.org/officeDocument/2006/bibliography"/>
   </ds:schemaRefs>

</xml_diff>